<commit_message>
fix: update job metadata and word count tracking
Update checkpoint files for jobs 170 and 'a' to reflect accurate total word counts and resolve warning states after document processing.
</commit_message>
<xml_diff>
--- a/jobs_storage/job_docx/output/report_FA.docx
+++ b/jobs_storage/job_docx/output/report_FA.docx
@@ -8,12 +8,12 @@
         <w:pStyle w:val="Heading1"/>
       </w:pPr>
       <w:r>
-        <w:t xml:space="preserve">پروژه Executive خلاصه</w:t>
+        <w:t xml:space="preserve">خلاصه اجرایی پروژه</w:t>
       </w:r>
     </w:p>
     <w:p>
       <w:r>
-        <w:t xml:space="preserve">This is the detailed گزارش for Q4 درآمد رشد.</w:t>
+        <w:t xml:space="preserve">این گزارش مشروح برای رشد درآمد سه ماهه چهارم است.</w:t>
       </w:r>
     </w:p>
   </w:body>

</xml_diff>